<commit_message>
Base de ce qu'il faut faire.
</commit_message>
<xml_diff>
--- a/ADP_URS_2026.docx
+++ b/ADP_URS_2026.docx
@@ -1161,7 +1161,13 @@
               <w:rPr>
                 <w:lang w:val="en-GB"/>
               </w:rPr>
-              <w:t>12</w:t>
+              <w:t>1</w:t>
+            </w:r>
+            <w:r>
+              <w:rPr>
+                <w:lang w:val="en-GB"/>
+              </w:rPr>
+              <w:t>3</w:t>
             </w:r>
             <w:r>
               <w:rPr>
@@ -1375,6 +1381,8 @@
             <w:proofErr w:type="spellStart"/>
             <w:r>
               <w:rPr>
+                <w:i/>
+                <w:iCs/>
                 <w:lang w:val="en-GB"/>
               </w:rPr>
               <w:t>TimeStamp</w:t>
@@ -1384,7 +1392,19 @@
               <w:rPr>
                 <w:lang w:val="en-GB"/>
               </w:rPr>
-              <w:t>, we mean a value like 2026-05-12 08:54:04 or 2026_05_12_08_54_04 if it needs to be used in a filename.</w:t>
+              <w:t>, we mean a value like 2026-05-12 08:54:04</w:t>
+            </w:r>
+            <w:r>
+              <w:rPr>
+                <w:lang w:val="en-GB"/>
+              </w:rPr>
+              <w:t xml:space="preserve"> into a file,</w:t>
+            </w:r>
+            <w:r>
+              <w:rPr>
+                <w:lang w:val="en-GB"/>
+              </w:rPr>
+              <w:t xml:space="preserve"> or 2026_05_12_08_54_04 if it needs to be used in a filename.</w:t>
             </w:r>
           </w:p>
         </w:tc>
@@ -1422,7 +1442,19 @@
               <w:rPr>
                 <w:lang w:val="en-GB"/>
               </w:rPr>
-              <w:t>By default, Zurich time is used</w:t>
+              <w:t xml:space="preserve">By default, Zurich time </w:t>
+            </w:r>
+            <w:r>
+              <w:rPr>
+                <w:lang w:val="en-GB"/>
+              </w:rPr>
+              <w:t>shall be</w:t>
+            </w:r>
+            <w:r>
+              <w:rPr>
+                <w:lang w:val="en-GB"/>
+              </w:rPr>
+              <w:t xml:space="preserve"> used</w:t>
             </w:r>
             <w:r>
               <w:rPr>
@@ -1539,7 +1571,19 @@
               <w:rPr>
                 <w:lang w:val="en-GB"/>
               </w:rPr>
-              <w:t>This project allows for simplified machine control on a single page accessible via an icon: test-tube</w:t>
+              <w:t xml:space="preserve">This project </w:t>
+            </w:r>
+            <w:r>
+              <w:rPr>
+                <w:lang w:val="en-GB"/>
+              </w:rPr>
+              <w:t>shall present</w:t>
+            </w:r>
+            <w:r>
+              <w:rPr>
+                <w:lang w:val="en-GB"/>
+              </w:rPr>
+              <w:t xml:space="preserve"> for simplified machine control a single page accessible via an icon: test-tube</w:t>
             </w:r>
             <w:r>
               <w:rPr>
@@ -1547,14 +1591,12 @@
               </w:rPr>
               <w:t xml:space="preserve"> in </w:t>
             </w:r>
-            <w:proofErr w:type="gramStart"/>
-            <w:r>
-              <w:rPr>
-                <w:lang w:val="en-GB"/>
-              </w:rPr>
-              <w:t>side-bar</w:t>
-            </w:r>
-            <w:proofErr w:type="gramEnd"/>
+            <w:r>
+              <w:rPr>
+                <w:lang w:val="en-GB"/>
+              </w:rPr>
+              <w:t>sidebar</w:t>
+            </w:r>
           </w:p>
         </w:tc>
       </w:tr>
@@ -1597,7 +1639,19 @@
               <w:rPr>
                 <w:lang w:val="en-GB"/>
               </w:rPr>
-              <w:t xml:space="preserve">A description page will be integrated and commented </w:t>
+              <w:t xml:space="preserve">A description page </w:t>
+            </w:r>
+            <w:r>
+              <w:rPr>
+                <w:lang w:val="en-GB"/>
+              </w:rPr>
+              <w:t>shall</w:t>
+            </w:r>
+            <w:r>
+              <w:rPr>
+                <w:lang w:val="en-GB"/>
+              </w:rPr>
+              <w:t xml:space="preserve"> be integrated and commented </w:t>
             </w:r>
             <w:r>
               <w:rPr>
@@ -1671,7 +1725,13 @@
               <w:rPr>
                 <w:lang w:val="en-GB"/>
               </w:rPr>
-              <w:t>This page with side-bar option fixed.</w:t>
+              <w:t>Simplified control</w:t>
+            </w:r>
+            <w:r>
+              <w:rPr>
+                <w:lang w:val="en-GB"/>
+              </w:rPr>
+              <w:t xml:space="preserve"> with side-bar option fixed.</w:t>
             </w:r>
           </w:p>
         </w:tc>
@@ -1709,7 +1769,19 @@
               <w:rPr>
                 <w:lang w:val="en-GB"/>
               </w:rPr>
-              <w:t>This page with notebook layout</w:t>
+              <w:t>Simplified control</w:t>
+            </w:r>
+            <w:r>
+              <w:rPr>
+                <w:lang w:val="en-GB"/>
+              </w:rPr>
+              <w:t xml:space="preserve"> with notebook layout</w:t>
+            </w:r>
+            <w:r>
+              <w:rPr>
+                <w:lang w:val="en-GB"/>
+              </w:rPr>
+              <w:t>.</w:t>
             </w:r>
           </w:p>
         </w:tc>
@@ -1802,13 +1874,7 @@
               <w:rPr>
                 <w:lang w:val="en-GB"/>
               </w:rPr>
-              <w:t>3</w:t>
-            </w:r>
-            <w:r>
-              <w:rPr>
-                <w:lang w:val="en-GB"/>
-              </w:rPr>
-              <w:t>.1</w:t>
+              <w:t>3.1</w:t>
             </w:r>
           </w:p>
         </w:tc>
@@ -1826,7 +1892,19 @@
               <w:rPr>
                 <w:lang w:val="en-GB"/>
               </w:rPr>
-              <w:t>The machine starts with a standard startup sequence: Clear, Reset, Start, which then transitions to the Stopped, Idle, and Execute states, respectively.</w:t>
+              <w:t xml:space="preserve">The machine </w:t>
+            </w:r>
+            <w:r>
+              <w:rPr>
+                <w:lang w:val="en-GB"/>
+              </w:rPr>
+              <w:t xml:space="preserve">shall </w:t>
+            </w:r>
+            <w:r>
+              <w:rPr>
+                <w:lang w:val="en-GB"/>
+              </w:rPr>
+              <w:t>start with a standard startup sequence: Clear, Reset, Start, which then transitions to the Stopped, Idle, and Execute states, respectively.</w:t>
             </w:r>
           </w:p>
         </w:tc>
@@ -1846,19 +1924,7 @@
               <w:rPr>
                 <w:lang w:val="en-GB"/>
               </w:rPr>
-              <w:t>3</w:t>
-            </w:r>
-            <w:r>
-              <w:rPr>
-                <w:lang w:val="en-GB"/>
-              </w:rPr>
-              <w:t>.</w:t>
-            </w:r>
-            <w:r>
-              <w:rPr>
-                <w:lang w:val="en-GB"/>
-              </w:rPr>
-              <w:t>2</w:t>
+              <w:t>3.2</w:t>
             </w:r>
           </w:p>
         </w:tc>
@@ -1876,7 +1942,19 @@
               <w:rPr>
                 <w:lang w:val="en-GB"/>
               </w:rPr>
-              <w:t>A Stop button allows switching from the Execute or Idle state to the Stopped state.</w:t>
+              <w:t xml:space="preserve">A Stop button </w:t>
+            </w:r>
+            <w:r>
+              <w:rPr>
+                <w:lang w:val="en-GB"/>
+              </w:rPr>
+              <w:t xml:space="preserve">shall </w:t>
+            </w:r>
+            <w:r>
+              <w:rPr>
+                <w:lang w:val="en-GB"/>
+              </w:rPr>
+              <w:t>allow switching from the Execute or Idle state to the Stopped state.</w:t>
             </w:r>
           </w:p>
         </w:tc>
@@ -1896,13 +1974,7 @@
               <w:rPr>
                 <w:lang w:val="en-GB"/>
               </w:rPr>
-              <w:t>3</w:t>
-            </w:r>
-            <w:r>
-              <w:rPr>
-                <w:lang w:val="en-GB"/>
-              </w:rPr>
-              <w:t>.3</w:t>
+              <w:t>3.3</w:t>
             </w:r>
           </w:p>
         </w:tc>
@@ -1920,7 +1992,19 @@
               <w:rPr>
                 <w:lang w:val="en-GB"/>
               </w:rPr>
-              <w:t>When the machine is in the Execute state, the X, Y, and Z axes are synchronized and ready for a Pick or Place sequence initiated by the operator.</w:t>
+              <w:t xml:space="preserve">When the machine is in the Execute state, the X, Y, and Z axes </w:t>
+            </w:r>
+            <w:r>
+              <w:rPr>
+                <w:lang w:val="en-GB"/>
+              </w:rPr>
+              <w:t>shall be</w:t>
+            </w:r>
+            <w:r>
+              <w:rPr>
+                <w:lang w:val="en-GB"/>
+              </w:rPr>
+              <w:t xml:space="preserve"> synchronized and ready for a Pick or Place sequence initiated by the operator.</w:t>
             </w:r>
           </w:p>
         </w:tc>
@@ -2045,13 +2129,7 @@
               <w:rPr>
                 <w:lang w:val="en-GB"/>
               </w:rPr>
-              <w:t>4</w:t>
-            </w:r>
-            <w:r>
-              <w:rPr>
-                <w:lang w:val="en-GB"/>
-              </w:rPr>
-              <w:t>.1</w:t>
+              <w:t>4.1</w:t>
             </w:r>
           </w:p>
         </w:tc>
@@ -2069,7 +2147,19 @@
               <w:rPr>
                 <w:lang w:val="en-GB"/>
               </w:rPr>
-              <w:t>The operator can select a nest number between 1 and 13.</w:t>
+              <w:t xml:space="preserve">The operator </w:t>
+            </w:r>
+            <w:r>
+              <w:rPr>
+                <w:lang w:val="en-GB"/>
+              </w:rPr>
+              <w:t xml:space="preserve">shall be able to select </w:t>
+            </w:r>
+            <w:r>
+              <w:rPr>
+                <w:lang w:val="en-GB"/>
+              </w:rPr>
+              <w:t>a nest number between 1 and 13.</w:t>
             </w:r>
           </w:p>
         </w:tc>
@@ -2089,13 +2179,7 @@
               <w:rPr>
                 <w:lang w:val="en-GB"/>
               </w:rPr>
-              <w:t>4</w:t>
-            </w:r>
-            <w:r>
-              <w:rPr>
-                <w:lang w:val="en-GB"/>
-              </w:rPr>
-              <w:t>.2</w:t>
+              <w:t>4.2</w:t>
             </w:r>
           </w:p>
         </w:tc>
@@ -2113,7 +2197,25 @@
               <w:rPr>
                 <w:lang w:val="en-GB"/>
               </w:rPr>
-              <w:t>The operator can select a speed between 0.01 and 0.3 m/s and an acceleration between 0.1 and 3 m/s².</w:t>
+              <w:t xml:space="preserve">The operator </w:t>
+            </w:r>
+            <w:r>
+              <w:rPr>
+                <w:lang w:val="en-GB"/>
+              </w:rPr>
+              <w:t xml:space="preserve">shall be able </w:t>
+            </w:r>
+            <w:r>
+              <w:rPr>
+                <w:lang w:val="en-GB"/>
+              </w:rPr>
+              <w:t xml:space="preserve">to select </w:t>
+            </w:r>
+            <w:r>
+              <w:rPr>
+                <w:lang w:val="en-GB"/>
+              </w:rPr>
+              <w:t>a speed between 0.01 and 0.3 m/s and an acceleration between 0.1 and 3 m/s².</w:t>
             </w:r>
           </w:p>
         </w:tc>
@@ -2133,13 +2235,7 @@
               <w:rPr>
                 <w:lang w:val="en-GB"/>
               </w:rPr>
-              <w:t>4</w:t>
-            </w:r>
-            <w:r>
-              <w:rPr>
-                <w:lang w:val="en-GB"/>
-              </w:rPr>
-              <w:t>.3</w:t>
+              <w:t>4.3</w:t>
             </w:r>
           </w:p>
         </w:tc>
@@ -2157,7 +2253,19 @@
               <w:rPr>
                 <w:lang w:val="en-GB"/>
               </w:rPr>
-              <w:t>The operator can initiate either a Pick sequence or a Place sequence.</w:t>
+              <w:t xml:space="preserve">The operator </w:t>
+            </w:r>
+            <w:r>
+              <w:rPr>
+                <w:lang w:val="en-GB"/>
+              </w:rPr>
+              <w:t>shall be able to</w:t>
+            </w:r>
+            <w:r>
+              <w:rPr>
+                <w:lang w:val="en-GB"/>
+              </w:rPr>
+              <w:t xml:space="preserve"> initiate either a Pick sequence or a Place sequence.</w:t>
             </w:r>
           </w:p>
         </w:tc>
@@ -2274,11 +2382,37 @@
               <w:rPr>
                 <w:lang w:val="en-GB"/>
               </w:rPr>
-              <w:t xml:space="preserve">Each action on the simplified command page is logged in a </w:t>
+              <w:t xml:space="preserve">Each action on the simplified </w:t>
+            </w:r>
+            <w:r>
+              <w:rPr>
+                <w:lang w:val="en-GB"/>
+              </w:rPr>
+              <w:t>control</w:t>
+            </w:r>
+            <w:r>
+              <w:rPr>
+                <w:lang w:val="en-GB"/>
+              </w:rPr>
+              <w:t xml:space="preserve"> page </w:t>
+            </w:r>
+            <w:r>
+              <w:rPr>
+                <w:lang w:val="en-GB"/>
+              </w:rPr>
+              <w:t>shall be</w:t>
+            </w:r>
+            <w:r>
+              <w:rPr>
+                <w:lang w:val="en-GB"/>
+              </w:rPr>
+              <w:t xml:space="preserve"> logged in a </w:t>
             </w:r>
             <w:proofErr w:type="spellStart"/>
             <w:r>
               <w:rPr>
+                <w:b/>
+                <w:bCs/>
                 <w:lang w:val="en-GB"/>
               </w:rPr>
               <w:t>logTubeEvent.json</w:t>
@@ -2286,9 +2420,17 @@
             <w:proofErr w:type="spellEnd"/>
             <w:r>
               <w:rPr>
-                <w:lang w:val="en-GB"/>
-              </w:rPr>
-              <w:t xml:space="preserve"> file</w:t>
+                <w:b/>
+                <w:bCs/>
+                <w:lang w:val="en-GB"/>
+              </w:rPr>
+              <w:t xml:space="preserve"> </w:t>
+            </w:r>
+            <w:r>
+              <w:rPr>
+                <w:lang w:val="en-GB"/>
+              </w:rPr>
+              <w:t>file</w:t>
             </w:r>
           </w:p>
         </w:tc>
@@ -2332,7 +2474,39 @@
               <w:rPr>
                 <w:lang w:val="en-GB"/>
               </w:rPr>
-              <w:t>The action log contains the timestamp and the button name</w:t>
+              <w:t xml:space="preserve">The action log </w:t>
+            </w:r>
+            <w:r>
+              <w:rPr>
+                <w:lang w:val="en-GB"/>
+              </w:rPr>
+              <w:t xml:space="preserve">shall </w:t>
+            </w:r>
+            <w:r>
+              <w:rPr>
+                <w:lang w:val="en-GB"/>
+              </w:rPr>
+              <w:t xml:space="preserve">contain the </w:t>
+            </w:r>
+            <w:r>
+              <w:rPr>
+                <w:i/>
+                <w:iCs/>
+                <w:lang w:val="en-GB"/>
+              </w:rPr>
+              <w:t>timestamp</w:t>
+            </w:r>
+            <w:r>
+              <w:rPr>
+                <w:lang w:val="en-GB"/>
+              </w:rPr>
+              <w:t xml:space="preserve"> and the button name</w:t>
+            </w:r>
+            <w:r>
+              <w:rPr>
+                <w:lang w:val="en-GB"/>
+              </w:rPr>
+              <w:t>.</w:t>
             </w:r>
           </w:p>
         </w:tc>
@@ -2376,7 +2550,33 @@
               <w:rPr>
                 <w:lang w:val="en-GB"/>
               </w:rPr>
-              <w:t>It's a plus to be able to include the username, saved in your Node-RED's User Settings.</w:t>
+              <w:t>It's a plus to be able to include the username, saved in your Node-RED's User Settings</w:t>
+            </w:r>
+            <w:r>
+              <w:rPr>
+                <w:lang w:val="en-GB"/>
+              </w:rPr>
+              <w:t xml:space="preserve"> in the </w:t>
+            </w:r>
+            <w:proofErr w:type="spellStart"/>
+            <w:r>
+              <w:rPr>
+                <w:lang w:val="en-GB"/>
+              </w:rPr>
+              <w:t>json</w:t>
+            </w:r>
+            <w:proofErr w:type="spellEnd"/>
+            <w:r>
+              <w:rPr>
+                <w:lang w:val="en-GB"/>
+              </w:rPr>
+              <w:t xml:space="preserve"> object</w:t>
+            </w:r>
+            <w:r>
+              <w:rPr>
+                <w:lang w:val="en-GB"/>
+              </w:rPr>
+              <w:t>.</w:t>
             </w:r>
           </w:p>
         </w:tc>
@@ -2416,16 +2616,12 @@
               </w:rPr>
               <w:t xml:space="preserve">It’s a plus if buttons are </w:t>
             </w:r>
-            <w:proofErr w:type="spellStart"/>
-            <w:proofErr w:type="gramStart"/>
-            <w:r>
-              <w:rPr>
-                <w:lang w:val="en-GB"/>
-              </w:rPr>
-              <w:t>build</w:t>
-            </w:r>
-            <w:proofErr w:type="spellEnd"/>
-            <w:proofErr w:type="gramEnd"/>
+            <w:r>
+              <w:rPr>
+                <w:lang w:val="en-GB"/>
+              </w:rPr>
+              <w:t>built</w:t>
+            </w:r>
             <w:r>
               <w:rPr>
                 <w:lang w:val="en-GB"/>
@@ -2482,11 +2678,31 @@
               <w:rPr>
                 <w:lang w:val="en-GB"/>
               </w:rPr>
-              <w:t xml:space="preserve">Each alarm and warning must be logged in a </w:t>
+              <w:t xml:space="preserve">Each alarm and warning </w:t>
+            </w:r>
+            <w:r>
+              <w:rPr>
+                <w:lang w:val="en-GB"/>
+              </w:rPr>
+              <w:t>shall</w:t>
+            </w:r>
+            <w:r>
+              <w:rPr>
+                <w:lang w:val="en-GB"/>
+              </w:rPr>
+              <w:t xml:space="preserve"> be logged in </w:t>
+            </w:r>
+            <w:r>
+              <w:rPr>
+                <w:lang w:val="en-GB"/>
+              </w:rPr>
+              <w:t xml:space="preserve">separate file </w:t>
             </w:r>
             <w:proofErr w:type="spellStart"/>
             <w:r>
               <w:rPr>
+                <w:b/>
+                <w:bCs/>
                 <w:lang w:val="en-GB"/>
               </w:rPr>
               <w:t>logAlarmsAndWarning.json</w:t>
@@ -2496,7 +2712,7 @@
               <w:rPr>
                 <w:lang w:val="en-GB"/>
               </w:rPr>
-              <w:t xml:space="preserve"> file.</w:t>
+              <w:t>.</w:t>
             </w:r>
           </w:p>
         </w:tc>
@@ -2589,13 +2805,7 @@
               <w:rPr>
                 <w:lang w:val="en-GB"/>
               </w:rPr>
-              <w:t>6</w:t>
-            </w:r>
-            <w:r>
-              <w:rPr>
-                <w:lang w:val="en-GB"/>
-              </w:rPr>
-              <w:t>.1</w:t>
+              <w:t>6.1</w:t>
             </w:r>
           </w:p>
         </w:tc>
@@ -2613,7 +2823,19 @@
               <w:rPr>
                 <w:lang w:val="en-GB"/>
               </w:rPr>
-              <w:t>Each robot movement is logged in a separate CSV file.</w:t>
+              <w:t xml:space="preserve">Each robot movement </w:t>
+            </w:r>
+            <w:r>
+              <w:rPr>
+                <w:lang w:val="en-GB"/>
+              </w:rPr>
+              <w:t>shall be</w:t>
+            </w:r>
+            <w:r>
+              <w:rPr>
+                <w:lang w:val="en-GB"/>
+              </w:rPr>
+              <w:t xml:space="preserve"> logged in a separate CSV file.</w:t>
             </w:r>
           </w:p>
         </w:tc>
@@ -2633,13 +2855,7 @@
               <w:rPr>
                 <w:lang w:val="en-GB"/>
               </w:rPr>
-              <w:t>6</w:t>
-            </w:r>
-            <w:r>
-              <w:rPr>
-                <w:lang w:val="en-GB"/>
-              </w:rPr>
-              <w:t>.2</w:t>
+              <w:t>6.2</w:t>
             </w:r>
           </w:p>
         </w:tc>
@@ -2657,7 +2873,53 @@
               <w:rPr>
                 <w:lang w:val="en-GB"/>
               </w:rPr>
-              <w:t>File name: PickTimeStamp.csv or PlaceTimeStamp.csv.</w:t>
+              <w:t>The f</w:t>
+            </w:r>
+            <w:r>
+              <w:rPr>
+                <w:lang w:val="en-GB"/>
+              </w:rPr>
+              <w:t>ile name</w:t>
+            </w:r>
+            <w:r>
+              <w:rPr>
+                <w:lang w:val="en-GB"/>
+              </w:rPr>
+              <w:t xml:space="preserve"> shall be</w:t>
+            </w:r>
+            <w:r>
+              <w:rPr>
+                <w:lang w:val="en-GB"/>
+              </w:rPr>
+              <w:t xml:space="preserve">: </w:t>
+            </w:r>
+            <w:r>
+              <w:rPr>
+                <w:b/>
+                <w:bCs/>
+                <w:lang w:val="en-GB"/>
+              </w:rPr>
+              <w:t>PickTimeStamp.csv</w:t>
+            </w:r>
+            <w:r>
+              <w:rPr>
+                <w:lang w:val="en-GB"/>
+              </w:rPr>
+              <w:t xml:space="preserve"> or </w:t>
+            </w:r>
+            <w:r>
+              <w:rPr>
+                <w:b/>
+                <w:bCs/>
+                <w:lang w:val="en-GB"/>
+              </w:rPr>
+              <w:t>PlaceTimeStamp.csv</w:t>
+            </w:r>
+            <w:r>
+              <w:rPr>
+                <w:lang w:val="en-GB"/>
+              </w:rPr>
+              <w:t>.</w:t>
             </w:r>
             <w:r>
               <w:rPr>
@@ -2683,13 +2945,75 @@
               <w:rPr>
                 <w:lang w:val="en-GB"/>
               </w:rPr>
+              <w:t>6.3</w:t>
+            </w:r>
+          </w:p>
+        </w:tc>
+        <w:tc>
+          <w:tcPr>
+            <w:tcW w:w="8414" w:type="dxa"/>
+          </w:tcPr>
+          <w:p>
+            <w:pPr>
+              <w:rPr>
+                <w:lang w:val="en-GB"/>
+              </w:rPr>
+            </w:pPr>
+            <w:r>
+              <w:rPr>
+                <w:lang w:val="en-GB"/>
+              </w:rPr>
+              <w:t xml:space="preserve">This file </w:t>
+            </w:r>
+            <w:r>
+              <w:rPr>
+                <w:lang w:val="en-GB"/>
+              </w:rPr>
+              <w:t xml:space="preserve">shall </w:t>
+            </w:r>
+            <w:r>
+              <w:rPr>
+                <w:lang w:val="en-GB"/>
+              </w:rPr>
+              <w:t>contain the X, Y, and Z position records in [mm], as well as the Sound</w:t>
+            </w:r>
+            <w:r>
+              <w:rPr>
+                <w:lang w:val="en-GB"/>
+              </w:rPr>
+              <w:t xml:space="preserve"> sensor</w:t>
+            </w:r>
+            <w:r>
+              <w:rPr>
+                <w:lang w:val="en-GB"/>
+              </w:rPr>
+              <w:t xml:space="preserve"> dimension in [mm] and the ambient temperature in [°C]. Two decimal places are used.</w:t>
+            </w:r>
+          </w:p>
+        </w:tc>
+      </w:tr>
+      <w:tr>
+        <w:tc>
+          <w:tcPr>
+            <w:tcW w:w="988" w:type="dxa"/>
+          </w:tcPr>
+          <w:p>
+            <w:pPr>
+              <w:rPr>
+                <w:lang w:val="en-GB"/>
+              </w:rPr>
+            </w:pPr>
+            <w:r>
+              <w:rPr>
+                <w:lang w:val="en-GB"/>
+              </w:rPr>
               <w:t>6</w:t>
             </w:r>
             <w:r>
               <w:rPr>
                 <w:lang w:val="en-GB"/>
               </w:rPr>
-              <w:t>.3</w:t>
+              <w:t>.4</w:t>
             </w:r>
           </w:p>
         </w:tc>
@@ -2707,19 +3031,7 @@
               <w:rPr>
                 <w:lang w:val="en-GB"/>
               </w:rPr>
-              <w:t>This file contains the X, Y, and Z position records in [mm], as well as the Sound</w:t>
-            </w:r>
-            <w:r>
-              <w:rPr>
-                <w:lang w:val="en-GB"/>
-              </w:rPr>
-              <w:t xml:space="preserve"> sensor</w:t>
-            </w:r>
-            <w:r>
-              <w:rPr>
-                <w:lang w:val="en-GB"/>
-              </w:rPr>
-              <w:t xml:space="preserve"> dimension in [mm] and the ambient temperature in [°C]. Two decimal places are used.</w:t>
+              <w:t>The values shall be separated by semi-column</w:t>
             </w:r>
           </w:p>
         </w:tc>
@@ -2812,13 +3124,7 @@
               <w:rPr>
                 <w:lang w:val="en-GB"/>
               </w:rPr>
-              <w:t>7</w:t>
-            </w:r>
-            <w:r>
-              <w:rPr>
-                <w:lang w:val="en-GB"/>
-              </w:rPr>
-              <w:t>.1</w:t>
+              <w:t>7.1</w:t>
             </w:r>
           </w:p>
         </w:tc>
@@ -2836,7 +3142,39 @@
               <w:rPr>
                 <w:lang w:val="en-GB"/>
               </w:rPr>
-              <w:t>It is necessary to be able to save an XML file at any time that contains the list of command parameters, including the list of nest positions for the tubes.</w:t>
+              <w:t>It shall be possible to store</w:t>
+            </w:r>
+            <w:r>
+              <w:rPr>
+                <w:lang w:val="en-GB"/>
+              </w:rPr>
+              <w:t xml:space="preserve"> an XML file at any time that contains the list of </w:t>
+            </w:r>
+            <w:proofErr w:type="spellStart"/>
+            <w:proofErr w:type="gramStart"/>
+            <w:r>
+              <w:rPr>
+                <w:i/>
+                <w:iCs/>
+                <w:lang w:val="en-GB"/>
+              </w:rPr>
+              <w:t>PackTag.Command.Parameter</w:t>
+            </w:r>
+            <w:proofErr w:type="gramEnd"/>
+            <w:r>
+              <w:rPr>
+                <w:i/>
+                <w:iCs/>
+                <w:lang w:val="en-GB"/>
+              </w:rPr>
+              <w:t>_Lreal</w:t>
+            </w:r>
+            <w:proofErr w:type="spellEnd"/>
+            <w:r>
+              <w:rPr>
+                <w:lang w:val="en-GB"/>
+              </w:rPr>
+              <w:t>, including the list of nest positions for the tubes.</w:t>
             </w:r>
           </w:p>
         </w:tc>
@@ -2856,13 +3194,7 @@
               <w:rPr>
                 <w:lang w:val="en-GB"/>
               </w:rPr>
-              <w:t>7</w:t>
-            </w:r>
-            <w:r>
-              <w:rPr>
-                <w:lang w:val="en-GB"/>
-              </w:rPr>
-              <w:t>.2</w:t>
+              <w:t>7.2</w:t>
             </w:r>
           </w:p>
         </w:tc>
@@ -2880,31 +3212,39 @@
               <w:rPr>
                 <w:lang w:val="en-GB"/>
               </w:rPr>
-              <w:t>File name: CmdTimeStamp.xml</w:t>
-            </w:r>
-            <w:r>
-              <w:rPr>
-                <w:lang w:val="en-GB"/>
-              </w:rPr>
-              <w:t xml:space="preserve"> </w:t>
-            </w:r>
-            <w:r>
-              <w:rPr>
-                <w:lang w:val="en-GB"/>
-              </w:rPr>
-              <w:t>s</w:t>
-            </w:r>
-            <w:r>
-              <w:rPr>
-                <w:lang w:val="en-GB"/>
-              </w:rPr>
-              <w:t>ee</w:t>
-            </w:r>
-            <w:r>
-              <w:rPr>
-                <w:lang w:val="en-GB"/>
-              </w:rPr>
-              <w:t xml:space="preserve"> URS ID 1.</w:t>
+              <w:t xml:space="preserve">The file </w:t>
+            </w:r>
+            <w:r>
+              <w:rPr>
+                <w:lang w:val="en-GB"/>
+              </w:rPr>
+              <w:t>name</w:t>
+            </w:r>
+            <w:r>
+              <w:rPr>
+                <w:lang w:val="en-GB"/>
+              </w:rPr>
+              <w:t xml:space="preserve"> shall be</w:t>
+            </w:r>
+            <w:r>
+              <w:rPr>
+                <w:lang w:val="en-GB"/>
+              </w:rPr>
+              <w:t xml:space="preserve">: </w:t>
+            </w:r>
+            <w:r>
+              <w:rPr>
+                <w:b/>
+                <w:bCs/>
+                <w:lang w:val="en-GB"/>
+              </w:rPr>
+              <w:t>CmdTimeStamp.xml</w:t>
+            </w:r>
+            <w:r>
+              <w:rPr>
+                <w:lang w:val="en-GB"/>
+              </w:rPr>
+              <w:t xml:space="preserve"> see URS ID 1.</w:t>
             </w:r>
           </w:p>
         </w:tc>
@@ -2924,13 +3264,7 @@
               <w:rPr>
                 <w:lang w:val="en-GB"/>
               </w:rPr>
-              <w:t>7</w:t>
-            </w:r>
-            <w:r>
-              <w:rPr>
-                <w:lang w:val="en-GB"/>
-              </w:rPr>
-              <w:t>.3</w:t>
+              <w:t>7.3</w:t>
             </w:r>
           </w:p>
         </w:tc>
@@ -2948,7 +3282,31 @@
               <w:rPr>
                 <w:lang w:val="en-GB"/>
               </w:rPr>
-              <w:t>This file contains the X, Y, and Z position records in [mm], as well as the Sound</w:t>
+              <w:t>Th</w:t>
+            </w:r>
+            <w:r>
+              <w:rPr>
+                <w:lang w:val="en-GB"/>
+              </w:rPr>
+              <w:t>e</w:t>
+            </w:r>
+            <w:r>
+              <w:rPr>
+                <w:lang w:val="en-GB"/>
+              </w:rPr>
+              <w:t xml:space="preserve"> file </w:t>
+            </w:r>
+            <w:r>
+              <w:rPr>
+                <w:lang w:val="en-GB"/>
+              </w:rPr>
+              <w:t xml:space="preserve">shall </w:t>
+            </w:r>
+            <w:r>
+              <w:rPr>
+                <w:lang w:val="en-GB"/>
+              </w:rPr>
+              <w:t>contain the X, Y, and Z position records in [mm], as well as the Sound</w:t>
             </w:r>
             <w:r>
               <w:rPr>
@@ -3071,12 +3429,32 @@
               <w:rPr>
                 <w:lang w:val="en-GB"/>
               </w:rPr>
-              <w:t xml:space="preserve">We want the list of versions required to install your </w:t>
+              <w:t xml:space="preserve">The software </w:t>
+            </w:r>
+            <w:r>
+              <w:rPr>
+                <w:lang w:val="en-GB"/>
+              </w:rPr>
+              <w:t>shall</w:t>
+            </w:r>
+            <w:r>
+              <w:rPr>
+                <w:lang w:val="en-GB"/>
+              </w:rPr>
+              <w:t xml:space="preserve"> provide a list of all the versions needed to </w:t>
+            </w:r>
+            <w:r>
+              <w:rPr>
+                <w:lang w:val="en-GB"/>
+              </w:rPr>
+              <w:t xml:space="preserve">load the </w:t>
             </w:r>
             <w:proofErr w:type="spellStart"/>
             <w:proofErr w:type="gramStart"/>
             <w:r>
               <w:rPr>
+                <w:b/>
+                <w:bCs/>
                 <w:lang w:val="en-GB"/>
               </w:rPr>
               <w:t>flows.json</w:t>
@@ -3087,7 +3465,13 @@
               <w:rPr>
                 <w:lang w:val="en-GB"/>
               </w:rPr>
-              <w:t xml:space="preserve"> on any other machine.</w:t>
+              <w:t xml:space="preserve"> </w:t>
+            </w:r>
+            <w:r>
+              <w:rPr>
+                <w:lang w:val="en-GB"/>
+              </w:rPr>
+              <w:t>on a new machine.</w:t>
             </w:r>
           </w:p>
         </w:tc>
@@ -3180,13 +3564,7 @@
               <w:rPr>
                 <w:lang w:val="en-GB"/>
               </w:rPr>
-              <w:t>9</w:t>
-            </w:r>
-            <w:r>
-              <w:rPr>
-                <w:lang w:val="en-GB"/>
-              </w:rPr>
-              <w:t>.1</w:t>
+              <w:t>9.1</w:t>
             </w:r>
           </w:p>
         </w:tc>
@@ -3204,7 +3582,19 @@
               <w:rPr>
                 <w:lang w:val="en-GB"/>
               </w:rPr>
-              <w:t>The URS, FS, DS, IQ, OQ, and PQ documents are submitted in hard copy.</w:t>
+              <w:t xml:space="preserve">The URS, FS, DS, IQ, OQ, and PQ documents </w:t>
+            </w:r>
+            <w:r>
+              <w:rPr>
+                <w:lang w:val="en-GB"/>
+              </w:rPr>
+              <w:t>shall be</w:t>
+            </w:r>
+            <w:r>
+              <w:rPr>
+                <w:lang w:val="en-GB"/>
+              </w:rPr>
+              <w:t xml:space="preserve"> submitted in hard copy.</w:t>
             </w:r>
           </w:p>
         </w:tc>
@@ -3242,7 +3632,43 @@
               <w:rPr>
                 <w:lang w:val="en-GB"/>
               </w:rPr>
-              <w:t>A final report and your JSON file will be archived on Moodle.</w:t>
+              <w:t xml:space="preserve">A final report and your JSON file </w:t>
+            </w:r>
+            <w:r>
+              <w:rPr>
+                <w:lang w:val="en-GB"/>
+              </w:rPr>
+              <w:t>shall</w:t>
+            </w:r>
+            <w:r>
+              <w:rPr>
+                <w:lang w:val="en-GB"/>
+              </w:rPr>
+              <w:t xml:space="preserve"> be archived on </w:t>
+            </w:r>
+            <w:r>
+              <w:rPr>
+                <w:lang w:val="en-GB"/>
+              </w:rPr>
+              <w:t xml:space="preserve">a </w:t>
+            </w:r>
+            <w:r>
+              <w:rPr>
+                <w:lang w:val="en-GB"/>
+              </w:rPr>
+              <w:t>Moodle</w:t>
+            </w:r>
+            <w:r>
+              <w:rPr>
+                <w:lang w:val="en-GB"/>
+              </w:rPr>
+              <w:t xml:space="preserve"> repository for each group</w:t>
+            </w:r>
+            <w:r>
+              <w:rPr>
+                <w:lang w:val="en-GB"/>
+              </w:rPr>
+              <w:t>.</w:t>
             </w:r>
           </w:p>
         </w:tc>
@@ -3263,6 +3689,12 @@
           <w:lang w:val="en-GB"/>
         </w:rPr>
       </w:pPr>
+      <w:r>
+        <w:rPr>
+          <w:lang w:val="en-GB"/>
+        </w:rPr>
+        <w:t xml:space="preserve"> </w:t>
+      </w:r>
     </w:p>
     <w:sectPr>
       <w:footerReference w:type="default" r:id="rId9"/>

</xml_diff>

<commit_message>
Document ready to start.
</commit_message>
<xml_diff>
--- a/ADP_URS_2026.docx
+++ b/ADP_URS_2026.docx
@@ -59,23 +59,7 @@
                 <w:b w:val="0"/>
                 <w:bCs/>
               </w:rPr>
-              <w:t xml:space="preserve">Tube </w:t>
-            </w:r>
-            <w:proofErr w:type="spellStart"/>
-            <w:r>
-              <w:rPr>
-                <w:b w:val="0"/>
-                <w:bCs/>
-              </w:rPr>
-              <w:t>manipulator</w:t>
-            </w:r>
-            <w:proofErr w:type="spellEnd"/>
-            <w:r>
-              <w:rPr>
-                <w:b w:val="0"/>
-                <w:bCs/>
-              </w:rPr>
-              <w:t xml:space="preserve"> robot.</w:t>
+              <w:t>Tube manipulator robot.</w:t>
             </w:r>
           </w:p>
         </w:tc>
@@ -1378,7 +1362,6 @@
               </w:rPr>
               <w:t xml:space="preserve">When referring to a </w:t>
             </w:r>
-            <w:proofErr w:type="spellStart"/>
             <w:r>
               <w:rPr>
                 <w:i/>
@@ -1387,7 +1370,6 @@
               </w:rPr>
               <w:t>TimeStamp</w:t>
             </w:r>
-            <w:proofErr w:type="spellEnd"/>
             <w:r>
               <w:rPr>
                 <w:lang w:val="en-GB"/>
@@ -2203,13 +2185,7 @@
               <w:rPr>
                 <w:lang w:val="en-GB"/>
               </w:rPr>
-              <w:t xml:space="preserve">shall be able </w:t>
-            </w:r>
-            <w:r>
-              <w:rPr>
-                <w:lang w:val="en-GB"/>
-              </w:rPr>
-              <w:t xml:space="preserve">to select </w:t>
+              <w:t xml:space="preserve">shall be able to select </w:t>
             </w:r>
             <w:r>
               <w:rPr>
@@ -2408,306 +2384,266 @@
               </w:rPr>
               <w:t xml:space="preserve"> logged in a </w:t>
             </w:r>
-            <w:proofErr w:type="spellStart"/>
             <w:r>
               <w:rPr>
                 <w:b/>
                 <w:bCs/>
                 <w:lang w:val="en-GB"/>
               </w:rPr>
-              <w:t>logTubeEvent.json</w:t>
-            </w:r>
-            <w:proofErr w:type="spellEnd"/>
+              <w:t xml:space="preserve">logTubeEvent.json </w:t>
+            </w:r>
+            <w:r>
+              <w:rPr>
+                <w:lang w:val="en-GB"/>
+              </w:rPr>
+              <w:t>file</w:t>
+            </w:r>
+          </w:p>
+        </w:tc>
+      </w:tr>
+      <w:tr>
+        <w:tc>
+          <w:tcPr>
+            <w:tcW w:w="988" w:type="dxa"/>
+          </w:tcPr>
+          <w:p>
+            <w:pPr>
+              <w:rPr>
+                <w:lang w:val="en-GB"/>
+              </w:rPr>
+            </w:pPr>
+            <w:r>
+              <w:rPr>
+                <w:lang w:val="en-GB"/>
+              </w:rPr>
+              <w:t>5</w:t>
+            </w:r>
+            <w:r>
+              <w:rPr>
+                <w:lang w:val="en-GB"/>
+              </w:rPr>
+              <w:t>.2</w:t>
+            </w:r>
+          </w:p>
+        </w:tc>
+        <w:tc>
+          <w:tcPr>
+            <w:tcW w:w="8414" w:type="dxa"/>
+          </w:tcPr>
+          <w:p>
+            <w:pPr>
+              <w:rPr>
+                <w:lang w:val="en-GB"/>
+              </w:rPr>
+            </w:pPr>
+            <w:r>
+              <w:rPr>
+                <w:lang w:val="en-GB"/>
+              </w:rPr>
+              <w:t xml:space="preserve">The action log </w:t>
+            </w:r>
+            <w:r>
+              <w:rPr>
+                <w:lang w:val="en-GB"/>
+              </w:rPr>
+              <w:t xml:space="preserve">shall </w:t>
+            </w:r>
+            <w:r>
+              <w:rPr>
+                <w:lang w:val="en-GB"/>
+              </w:rPr>
+              <w:t xml:space="preserve">contain the </w:t>
+            </w:r>
+            <w:r>
+              <w:rPr>
+                <w:i/>
+                <w:iCs/>
+                <w:lang w:val="en-GB"/>
+              </w:rPr>
+              <w:t>timestamp</w:t>
+            </w:r>
+            <w:r>
+              <w:rPr>
+                <w:lang w:val="en-GB"/>
+              </w:rPr>
+              <w:t xml:space="preserve"> and the button name</w:t>
+            </w:r>
+            <w:r>
+              <w:rPr>
+                <w:lang w:val="en-GB"/>
+              </w:rPr>
+              <w:t>.</w:t>
+            </w:r>
+          </w:p>
+        </w:tc>
+      </w:tr>
+      <w:tr>
+        <w:tc>
+          <w:tcPr>
+            <w:tcW w:w="988" w:type="dxa"/>
+          </w:tcPr>
+          <w:p>
+            <w:pPr>
+              <w:rPr>
+                <w:lang w:val="en-GB"/>
+              </w:rPr>
+            </w:pPr>
+            <w:r>
+              <w:rPr>
+                <w:lang w:val="en-GB"/>
+              </w:rPr>
+              <w:t>5</w:t>
+            </w:r>
+            <w:r>
+              <w:rPr>
+                <w:lang w:val="en-GB"/>
+              </w:rPr>
+              <w:t>.3</w:t>
+            </w:r>
+          </w:p>
+        </w:tc>
+        <w:tc>
+          <w:tcPr>
+            <w:tcW w:w="8414" w:type="dxa"/>
+          </w:tcPr>
+          <w:p>
+            <w:pPr>
+              <w:rPr>
+                <w:lang w:val="en-GB"/>
+              </w:rPr>
+            </w:pPr>
+            <w:r>
+              <w:rPr>
+                <w:lang w:val="en-GB"/>
+              </w:rPr>
+              <w:t>It's a plus to be able to include the username, saved in your Node-RED's User Settings</w:t>
+            </w:r>
+            <w:r>
+              <w:rPr>
+                <w:lang w:val="en-GB"/>
+              </w:rPr>
+              <w:t xml:space="preserve"> in the json object</w:t>
+            </w:r>
+            <w:r>
+              <w:rPr>
+                <w:lang w:val="en-GB"/>
+              </w:rPr>
+              <w:t>.</w:t>
+            </w:r>
+          </w:p>
+        </w:tc>
+      </w:tr>
+      <w:tr>
+        <w:tc>
+          <w:tcPr>
+            <w:tcW w:w="988" w:type="dxa"/>
+          </w:tcPr>
+          <w:p>
+            <w:pPr>
+              <w:rPr>
+                <w:lang w:val="en-GB"/>
+              </w:rPr>
+            </w:pPr>
+            <w:r>
+              <w:rPr>
+                <w:lang w:val="en-GB"/>
+              </w:rPr>
+              <w:t>5.4</w:t>
+            </w:r>
+          </w:p>
+        </w:tc>
+        <w:tc>
+          <w:tcPr>
+            <w:tcW w:w="8414" w:type="dxa"/>
+          </w:tcPr>
+          <w:p>
+            <w:pPr>
+              <w:rPr>
+                <w:lang w:val="en-GB"/>
+              </w:rPr>
+            </w:pPr>
+            <w:r>
+              <w:rPr>
+                <w:lang w:val="en-GB"/>
+              </w:rPr>
+              <w:t xml:space="preserve">It’s a plus if buttons are </w:t>
+            </w:r>
+            <w:r>
+              <w:rPr>
+                <w:lang w:val="en-GB"/>
+              </w:rPr>
+              <w:t>built</w:t>
+            </w:r>
+            <w:r>
+              <w:rPr>
+                <w:lang w:val="en-GB"/>
+              </w:rPr>
+              <w:t xml:space="preserve"> with customisable subflows.</w:t>
+            </w:r>
+          </w:p>
+        </w:tc>
+      </w:tr>
+      <w:tr>
+        <w:tc>
+          <w:tcPr>
+            <w:tcW w:w="988" w:type="dxa"/>
+          </w:tcPr>
+          <w:p>
+            <w:pPr>
+              <w:rPr>
+                <w:lang w:val="en-GB"/>
+              </w:rPr>
+            </w:pPr>
+            <w:r>
+              <w:rPr>
+                <w:lang w:val="en-GB"/>
+              </w:rPr>
+              <w:t>5.5</w:t>
+            </w:r>
+          </w:p>
+        </w:tc>
+        <w:tc>
+          <w:tcPr>
+            <w:tcW w:w="8414" w:type="dxa"/>
+          </w:tcPr>
+          <w:p>
+            <w:pPr>
+              <w:rPr>
+                <w:lang w:val="en-GB"/>
+              </w:rPr>
+            </w:pPr>
+            <w:r>
+              <w:rPr>
+                <w:lang w:val="en-GB"/>
+              </w:rPr>
+              <w:t xml:space="preserve">Each alarm and warning </w:t>
+            </w:r>
+            <w:r>
+              <w:rPr>
+                <w:lang w:val="en-GB"/>
+              </w:rPr>
+              <w:t>shall</w:t>
+            </w:r>
+            <w:r>
+              <w:rPr>
+                <w:lang w:val="en-GB"/>
+              </w:rPr>
+              <w:t xml:space="preserve"> be logged in </w:t>
+            </w:r>
+            <w:r>
+              <w:rPr>
+                <w:lang w:val="en-GB"/>
+              </w:rPr>
+              <w:t xml:space="preserve">separate file </w:t>
+            </w:r>
             <w:r>
               <w:rPr>
                 <w:b/>
                 <w:bCs/>
                 <w:lang w:val="en-GB"/>
               </w:rPr>
-              <w:t xml:space="preserve"> </w:t>
-            </w:r>
-            <w:r>
-              <w:rPr>
-                <w:lang w:val="en-GB"/>
-              </w:rPr>
-              <w:t>file</w:t>
-            </w:r>
-          </w:p>
-        </w:tc>
-      </w:tr>
-      <w:tr>
-        <w:tc>
-          <w:tcPr>
-            <w:tcW w:w="988" w:type="dxa"/>
-          </w:tcPr>
-          <w:p>
-            <w:pPr>
-              <w:rPr>
-                <w:lang w:val="en-GB"/>
-              </w:rPr>
-            </w:pPr>
-            <w:r>
-              <w:rPr>
-                <w:lang w:val="en-GB"/>
-              </w:rPr>
-              <w:t>5</w:t>
-            </w:r>
-            <w:r>
-              <w:rPr>
-                <w:lang w:val="en-GB"/>
-              </w:rPr>
-              <w:t>.2</w:t>
-            </w:r>
-          </w:p>
-        </w:tc>
-        <w:tc>
-          <w:tcPr>
-            <w:tcW w:w="8414" w:type="dxa"/>
-          </w:tcPr>
-          <w:p>
-            <w:pPr>
-              <w:rPr>
-                <w:lang w:val="en-GB"/>
-              </w:rPr>
-            </w:pPr>
-            <w:r>
-              <w:rPr>
-                <w:lang w:val="en-GB"/>
-              </w:rPr>
-              <w:t xml:space="preserve">The action log </w:t>
-            </w:r>
-            <w:r>
-              <w:rPr>
-                <w:lang w:val="en-GB"/>
-              </w:rPr>
-              <w:t xml:space="preserve">shall </w:t>
-            </w:r>
-            <w:r>
-              <w:rPr>
-                <w:lang w:val="en-GB"/>
-              </w:rPr>
-              <w:t xml:space="preserve">contain the </w:t>
-            </w:r>
-            <w:r>
-              <w:rPr>
-                <w:i/>
-                <w:iCs/>
-                <w:lang w:val="en-GB"/>
-              </w:rPr>
-              <w:t>timestamp</w:t>
-            </w:r>
-            <w:r>
-              <w:rPr>
-                <w:lang w:val="en-GB"/>
-              </w:rPr>
-              <w:t xml:space="preserve"> and the button name</w:t>
-            </w:r>
-            <w:r>
-              <w:rPr>
-                <w:lang w:val="en-GB"/>
-              </w:rPr>
-              <w:t>.</w:t>
-            </w:r>
-          </w:p>
-        </w:tc>
-      </w:tr>
-      <w:tr>
-        <w:tc>
-          <w:tcPr>
-            <w:tcW w:w="988" w:type="dxa"/>
-          </w:tcPr>
-          <w:p>
-            <w:pPr>
-              <w:rPr>
-                <w:lang w:val="en-GB"/>
-              </w:rPr>
-            </w:pPr>
-            <w:r>
-              <w:rPr>
-                <w:lang w:val="en-GB"/>
-              </w:rPr>
-              <w:t>5</w:t>
-            </w:r>
-            <w:r>
-              <w:rPr>
-                <w:lang w:val="en-GB"/>
-              </w:rPr>
-              <w:t>.3</w:t>
-            </w:r>
-          </w:p>
-        </w:tc>
-        <w:tc>
-          <w:tcPr>
-            <w:tcW w:w="8414" w:type="dxa"/>
-          </w:tcPr>
-          <w:p>
-            <w:pPr>
-              <w:rPr>
-                <w:lang w:val="en-GB"/>
-              </w:rPr>
-            </w:pPr>
-            <w:r>
-              <w:rPr>
-                <w:lang w:val="en-GB"/>
-              </w:rPr>
-              <w:t>It's a plus to be able to include the username, saved in your Node-RED's User Settings</w:t>
-            </w:r>
-            <w:r>
-              <w:rPr>
-                <w:lang w:val="en-GB"/>
-              </w:rPr>
-              <w:t xml:space="preserve"> in the </w:t>
-            </w:r>
-            <w:proofErr w:type="spellStart"/>
-            <w:r>
-              <w:rPr>
-                <w:lang w:val="en-GB"/>
-              </w:rPr>
-              <w:t>json</w:t>
-            </w:r>
-            <w:proofErr w:type="spellEnd"/>
-            <w:r>
-              <w:rPr>
-                <w:lang w:val="en-GB"/>
-              </w:rPr>
-              <w:t xml:space="preserve"> object</w:t>
-            </w:r>
-            <w:r>
-              <w:rPr>
-                <w:lang w:val="en-GB"/>
-              </w:rPr>
-              <w:t>.</w:t>
-            </w:r>
-          </w:p>
-        </w:tc>
-      </w:tr>
-      <w:tr>
-        <w:tc>
-          <w:tcPr>
-            <w:tcW w:w="988" w:type="dxa"/>
-          </w:tcPr>
-          <w:p>
-            <w:pPr>
-              <w:rPr>
-                <w:lang w:val="en-GB"/>
-              </w:rPr>
-            </w:pPr>
-            <w:r>
-              <w:rPr>
-                <w:lang w:val="en-GB"/>
-              </w:rPr>
-              <w:t>5.4</w:t>
-            </w:r>
-          </w:p>
-        </w:tc>
-        <w:tc>
-          <w:tcPr>
-            <w:tcW w:w="8414" w:type="dxa"/>
-          </w:tcPr>
-          <w:p>
-            <w:pPr>
-              <w:rPr>
-                <w:lang w:val="en-GB"/>
-              </w:rPr>
-            </w:pPr>
-            <w:r>
-              <w:rPr>
-                <w:lang w:val="en-GB"/>
-              </w:rPr>
-              <w:t xml:space="preserve">It’s a plus if buttons are </w:t>
-            </w:r>
-            <w:r>
-              <w:rPr>
-                <w:lang w:val="en-GB"/>
-              </w:rPr>
-              <w:t>built</w:t>
-            </w:r>
-            <w:r>
-              <w:rPr>
-                <w:lang w:val="en-GB"/>
-              </w:rPr>
-              <w:t xml:space="preserve"> with customisable </w:t>
-            </w:r>
-            <w:proofErr w:type="spellStart"/>
-            <w:r>
-              <w:rPr>
-                <w:lang w:val="en-GB"/>
-              </w:rPr>
-              <w:t>subflows</w:t>
-            </w:r>
-            <w:proofErr w:type="spellEnd"/>
-            <w:r>
-              <w:rPr>
-                <w:lang w:val="en-GB"/>
-              </w:rPr>
-              <w:t>.</w:t>
-            </w:r>
-          </w:p>
-        </w:tc>
-      </w:tr>
-      <w:tr>
-        <w:tc>
-          <w:tcPr>
-            <w:tcW w:w="988" w:type="dxa"/>
-          </w:tcPr>
-          <w:p>
-            <w:pPr>
-              <w:rPr>
-                <w:lang w:val="en-GB"/>
-              </w:rPr>
-            </w:pPr>
-            <w:r>
-              <w:rPr>
-                <w:lang w:val="en-GB"/>
-              </w:rPr>
-              <w:t>5.5</w:t>
-            </w:r>
-          </w:p>
-        </w:tc>
-        <w:tc>
-          <w:tcPr>
-            <w:tcW w:w="8414" w:type="dxa"/>
-          </w:tcPr>
-          <w:p>
-            <w:pPr>
-              <w:rPr>
-                <w:lang w:val="en-GB"/>
-              </w:rPr>
-            </w:pPr>
-            <w:r>
-              <w:rPr>
-                <w:lang w:val="en-GB"/>
-              </w:rPr>
-              <w:t xml:space="preserve">Each alarm and warning </w:t>
-            </w:r>
-            <w:r>
-              <w:rPr>
-                <w:lang w:val="en-GB"/>
-              </w:rPr>
-              <w:t>shall</w:t>
-            </w:r>
-            <w:r>
-              <w:rPr>
-                <w:lang w:val="en-GB"/>
-              </w:rPr>
-              <w:t xml:space="preserve"> be logged in </w:t>
-            </w:r>
-            <w:r>
-              <w:rPr>
-                <w:lang w:val="en-GB"/>
-              </w:rPr>
-              <w:t xml:space="preserve">separate file </w:t>
-            </w:r>
-            <w:proofErr w:type="spellStart"/>
-            <w:r>
-              <w:rPr>
-                <w:b/>
-                <w:bCs/>
-                <w:lang w:val="en-GB"/>
-              </w:rPr>
               <w:t>logAlarmsAndWarning.json</w:t>
             </w:r>
-            <w:proofErr w:type="spellEnd"/>
             <w:r>
               <w:rPr>
                 <w:lang w:val="en-GB"/>
@@ -2975,7 +2911,43 @@
               <w:rPr>
                 <w:lang w:val="en-GB"/>
               </w:rPr>
-              <w:t>contain the X, Y, and Z position records in [mm], as well as the Sound</w:t>
+              <w:t xml:space="preserve">contain the </w:t>
+            </w:r>
+            <w:r>
+              <w:rPr>
+                <w:lang w:val="en-GB"/>
+              </w:rPr>
+              <w:t>on each row a timestamp;</w:t>
+            </w:r>
+            <w:r>
+              <w:rPr>
+                <w:lang w:val="en-GB"/>
+              </w:rPr>
+              <w:t>X</w:t>
+            </w:r>
+            <w:r>
+              <w:rPr>
+                <w:lang w:val="en-GB"/>
+              </w:rPr>
+              <w:t>;</w:t>
+            </w:r>
+            <w:r>
+              <w:rPr>
+                <w:lang w:val="en-GB"/>
+              </w:rPr>
+              <w:t xml:space="preserve"> Y</w:t>
+            </w:r>
+            <w:r>
+              <w:rPr>
+                <w:lang w:val="en-GB"/>
+              </w:rPr>
+              <w:t>;</w:t>
+            </w:r>
+            <w:r>
+              <w:rPr>
+                <w:lang w:val="en-GB"/>
+              </w:rPr>
+              <w:t xml:space="preserve"> and Z position records in [mm], as well as the Sound</w:t>
             </w:r>
             <w:r>
               <w:rPr>
@@ -3007,13 +2979,7 @@
               <w:rPr>
                 <w:lang w:val="en-GB"/>
               </w:rPr>
-              <w:t>6</w:t>
-            </w:r>
-            <w:r>
-              <w:rPr>
-                <w:lang w:val="en-GB"/>
-              </w:rPr>
-              <w:t>.4</w:t>
+              <w:t>6.4</w:t>
             </w:r>
           </w:p>
         </w:tc>
@@ -3150,26 +3116,14 @@
               </w:rPr>
               <w:t xml:space="preserve"> an XML file at any time that contains the list of </w:t>
             </w:r>
-            <w:proofErr w:type="spellStart"/>
-            <w:proofErr w:type="gramStart"/>
             <w:r>
               <w:rPr>
                 <w:i/>
                 <w:iCs/>
                 <w:lang w:val="en-GB"/>
               </w:rPr>
-              <w:t>PackTag.Command.Parameter</w:t>
-            </w:r>
-            <w:proofErr w:type="gramEnd"/>
-            <w:r>
-              <w:rPr>
-                <w:i/>
-                <w:iCs/>
-                <w:lang w:val="en-GB"/>
-              </w:rPr>
-              <w:t>_Lreal</w:t>
-            </w:r>
-            <w:proofErr w:type="spellEnd"/>
+              <w:t>PackTag.Command.Parameter_Lreal</w:t>
+            </w:r>
             <w:r>
               <w:rPr>
                 <w:lang w:val="en-GB"/>
@@ -3449,8 +3403,6 @@
               </w:rPr>
               <w:t xml:space="preserve">load the </w:t>
             </w:r>
-            <w:proofErr w:type="spellStart"/>
-            <w:proofErr w:type="gramStart"/>
             <w:r>
               <w:rPr>
                 <w:b/>
@@ -3459,8 +3411,6 @@
               </w:rPr>
               <w:t>flows.json</w:t>
             </w:r>
-            <w:proofErr w:type="spellEnd"/>
-            <w:proofErr w:type="gramEnd"/>
             <w:r>
               <w:rPr>
                 <w:lang w:val="en-GB"/>

</xml_diff>